<commit_message>
dll_injection, toyos project를 진행함
dll_injection공격과 방어기법이 들어간 보고서를 완성했고 실제로 다양한 방어기법에 대해서 알게 됬고 두 번째로 toyos project같은 경우에는 커널 레벨에서 기본적인 쉘을 만들고 소프트웨어공학의 개발 방법론을 적용한 개발을 하기 위해 요구분석을 시작했다
</commit_message>
<xml_diff>
--- a/projects/toyos_project/toy_os2.docx
+++ b/projects/toyos_project/toy_os2.docx
@@ -22966,7 +22966,7 @@
           <w:rtl w:val="off"/>
         </w:rPr>
         <w:drawing>
-          <wp:inline distT="0" distB="0" distL="180" distR="180">
+          <wp:inline distT="0" distB="0" distL="0" distR="0">
             <wp:extent cx="4591050" cy="1130300"/>
             <wp:effectExtent l="0" t="0" r="0" b="0"/>
             <wp:docPr id="1055" name="shape1055" hidden="0"/>
@@ -23080,25 +23080,25 @@
         </w:tabs>
         <w:rPr>
           <w:lang w:eastAsia="ko-KR"/>
-          <w:rFonts w:hint="eastAsia"/>
-          <w:b w:val="0"/>
-          <w:bCs w:val="0"/>
-          <w:sz w:val="26"/>
-          <w:szCs w:val="26"/>
-          <w:rtl w:val="off"/>
-        </w:rPr>
-      </w:pPr>
-      <w:r>
-        <w:rPr>
-          <w:lang w:eastAsia="ko-KR"/>
-          <w:rFonts w:hint="eastAsia"/>
-          <w:b w:val="0"/>
-          <w:bCs w:val="0"/>
-          <w:sz w:val="26"/>
-          <w:szCs w:val="26"/>
-          <w:rtl w:val="off"/>
-        </w:rPr>
-        <w:t>그 다음에는 지금까지는 파일 수가 적어서 하나씩 전부 그냥 obj파일로 만들고 linker로 연결하고 그 다음에 bin로 바꿔서 disk에 올렸지만 이제는 너무 코드 파일이 많아져서 이를 잘 관리하기 위해서 make file을 만들기로 했다.</w:t>
+          <w:rFonts/>
+          <w:b w:val="0"/>
+          <w:bCs w:val="0"/>
+          <w:sz w:val="26"/>
+          <w:szCs w:val="26"/>
+          <w:rtl w:val="off"/>
+        </w:rPr>
+      </w:pPr>
+      <w:r>
+        <w:rPr>
+          <w:lang w:eastAsia="ko-KR"/>
+          <w:rFonts w:hint="eastAsia"/>
+          <w:b w:val="0"/>
+          <w:bCs w:val="0"/>
+          <w:sz w:val="26"/>
+          <w:szCs w:val="26"/>
+          <w:rtl w:val="off"/>
+        </w:rPr>
+        <w:t>그 다음에는 지금까지는 파일 수가 적어서 하나씩 전부 그냥 obj파일로 만들고 linker로 연결하고 그 다음에 bin로 바꿔서 disk에 올렸지만 이제는 너무 코드 파일이 많아져서 이를 잘 관리하기 위해서 makefile을 만들기로 했다.</w:t>
       </w:r>
     </w:p>
     <w:p>
@@ -23109,7 +23109,7 @@
         </w:tabs>
         <w:rPr>
           <w:lang w:eastAsia="ko-KR"/>
-          <w:rFonts w:hint="eastAsia"/>
+          <w:rFonts/>
           <w:b w:val="0"/>
           <w:bCs w:val="0"/>
           <w:sz w:val="26"/>
@@ -23134,6 +23134,18 @@
           <w:rtl w:val="off"/>
         </w:rPr>
       </w:pPr>
+      <w:r>
+        <w:rPr>
+          <w:lang w:eastAsia="ko-KR"/>
+          <w:rFonts w:hint="eastAsia"/>
+          <w:b w:val="0"/>
+          <w:bCs w:val="0"/>
+          <w:sz w:val="26"/>
+          <w:szCs w:val="26"/>
+          <w:rtl w:val="off"/>
+        </w:rPr>
+        <w:t xml:space="preserve">이 다음의 목표는 우선 backspace명령어를 제외하고서는 기본적인 입력한 키를 출력하게 키보드 함수를 수정했는데 우선 그러기 위해서는 각 inb에 따른 출력 문자표를 만들기 위해서 ai에게 이 부분을 요청해서 쉽게 만들었고 그 다음에는 이제 입력으로 받은 게 출력할 수 있는 범위에 있는지를 확인한 다음에 범위내에 존재시 출력하게 코드를 작성했다.    </w:t>
+      </w:r>
     </w:p>
     <w:p>
       <w:pPr>
@@ -23151,6 +23163,59 @@
           <w:rtl w:val="off"/>
         </w:rPr>
       </w:pPr>
+      <w:r>
+        <w:rPr>
+          <w:lang w:eastAsia="ko-KR"/>
+          <w:rFonts w:hint="eastAsia"/>
+          <w:b w:val="0"/>
+          <w:bCs w:val="0"/>
+          <w:sz w:val="26"/>
+          <w:szCs w:val="26"/>
+          <w:rtl w:val="off"/>
+        </w:rPr>
+        <w:drawing>
+          <wp:inline distT="0" distB="0" distL="0" distR="0">
+            <wp:extent cx="4578350" cy="1019175"/>
+            <wp:effectExtent l="0" t="0" r="0" b="0"/>
+            <wp:docPr id="1056" name="shape1056" hidden="0"/>
+            <wp:cNvGraphicFramePr>
+              <a:graphicFrameLocks xmlns:a="http://schemas.openxmlformats.org/drawingml/2006/main" noChangeAspect="1"/>
+            </wp:cNvGraphicFramePr>
+            <a:graphic xmlns:a="http://schemas.openxmlformats.org/drawingml/2006/main">
+              <a:graphicData uri="http://schemas.openxmlformats.org/drawingml/2006/picture">
+                <pic:pic xmlns:pic="http://schemas.openxmlformats.org/drawingml/2006/picture">
+                  <pic:nvPicPr>
+                    <pic:cNvPr id="0" name="이미지"/>
+                    <pic:cNvPicPr preferRelativeResize="1">
+                      <a:picLocks noChangeAspect="1"/>
+                    </pic:cNvPicPr>
+                  </pic:nvPicPr>
+                  <pic:blipFill>
+                    <a:blip r:embed="rId32">
+                      <a:extLst>
+                        <a:ext uri="{28A0092B-C50C-407E-A947-70E740481C1C}">
+                          <a14:useLocalDpi xmlns:a14="http://schemas.microsoft.com/office/drawing/2010/main" val="0"/>
+                        </a:ext>
+                      </a:extLst>
+                    </a:blip>
+                    <a:srcRect/>
+                    <a:stretch>
+                      <a:fillRect/>
+                    </a:stretch>
+                  </pic:blipFill>
+                  <pic:spPr>
+                    <a:xfrm>
+                      <a:off x="0" y="0"/>
+                      <a:ext cx="4578350" cy="1019175"/>
+                    </a:xfrm>
+                    <a:prstGeom prst="rect"/>
+                  </pic:spPr>
+                </pic:pic>
+              </a:graphicData>
+            </a:graphic>
+          </wp:inline>
+        </w:drawing>
+      </w:r>
     </w:p>
     <w:p>
       <w:pPr>
@@ -23185,6 +23250,18 @@
           <w:rtl w:val="off"/>
         </w:rPr>
       </w:pPr>
+      <w:r>
+        <w:rPr>
+          <w:lang w:eastAsia="ko-KR"/>
+          <w:rFonts w:hint="eastAsia"/>
+          <w:b w:val="0"/>
+          <w:bCs w:val="0"/>
+          <w:sz w:val="26"/>
+          <w:szCs w:val="26"/>
+          <w:rtl w:val="off"/>
+        </w:rPr>
+        <w:t>.</w:t>
+      </w:r>
     </w:p>
     <w:p>
       <w:pPr>
@@ -23202,6 +23279,18 @@
           <w:rtl w:val="off"/>
         </w:rPr>
       </w:pPr>
+      <w:r>
+        <w:rPr>
+          <w:lang w:eastAsia="ko-KR"/>
+          <w:rFonts w:hint="eastAsia"/>
+          <w:b w:val="0"/>
+          <w:bCs w:val="0"/>
+          <w:sz w:val="26"/>
+          <w:szCs w:val="26"/>
+          <w:rtl w:val="off"/>
+        </w:rPr>
+        <w:t>그 다음에는 backspace명령어를 구현하기 위해 기존의 vga.c파일을 수정해 c로 들어온 입력이 ‘\b’인 경우에 대해서 col = 0 즉 더 이상 앞으로 이동할 공간이 없으면 그대로 있고 아닌 경우에는 한 칸 앞으로 vga index를 이동시키고 그러면서 그 위치에 공백 문자열을 출력하게 코드를 바꿨다.</w:t>
+      </w:r>
     </w:p>
     <w:p>
       <w:pPr>
@@ -23236,6 +23325,306 @@
           <w:rtl w:val="off"/>
         </w:rPr>
       </w:pPr>
+      <w:r>
+        <w:rPr>
+          <w:lang w:eastAsia="ko-KR"/>
+          <w:rFonts w:hint="eastAsia"/>
+          <w:b w:val="0"/>
+          <w:bCs w:val="0"/>
+          <w:sz w:val="26"/>
+          <w:szCs w:val="26"/>
+          <w:rtl w:val="off"/>
+        </w:rPr>
+        <w:t>그 다음에는 현재 논리 커서와 하드웨어 커서가 일치하지 않는 게 보여서 이 부분을 수정하기로 했다. 이 때는 기존에 구현한 outb함수를 이용해서 이 둘을 일치시키는 함수를 vga.c에 static으로 만들고 vga.c내부에서만 호출하기로 결정하고 함수를 작성했다. 그 다음에는 이를 put_char함수의 각 상황별 return문 앞과 clean_screen함수의 return문 앞에 추가했다.</w:t>
+      </w:r>
+    </w:p>
+    <w:p>
+      <w:pPr>
+        <w:jc w:val="left"/>
+        <w:tabs>
+          <w:tab w:val="left" w:pos="7892"/>
+        </w:tabs>
+        <w:rPr>
+          <w:lang w:eastAsia="ko-KR"/>
+          <w:rFonts w:hint="eastAsia"/>
+          <w:b w:val="0"/>
+          <w:bCs w:val="0"/>
+          <w:sz w:val="26"/>
+          <w:szCs w:val="26"/>
+          <w:rtl w:val="off"/>
+        </w:rPr>
+      </w:pPr>
+    </w:p>
+    <w:p>
+      <w:pPr>
+        <w:jc w:val="left"/>
+        <w:tabs>
+          <w:tab w:val="left" w:pos="7892"/>
+        </w:tabs>
+        <w:rPr>
+          <w:lang w:eastAsia="ko-KR"/>
+          <w:rFonts w:hint="eastAsia"/>
+          <w:b w:val="0"/>
+          <w:bCs w:val="0"/>
+          <w:sz w:val="26"/>
+          <w:szCs w:val="26"/>
+          <w:rtl w:val="off"/>
+        </w:rPr>
+      </w:pPr>
+      <w:r>
+        <w:rPr>
+          <w:lang w:eastAsia="ko-KR"/>
+          <w:rFonts w:hint="eastAsia"/>
+          <w:b w:val="0"/>
+          <w:bCs w:val="0"/>
+          <w:sz w:val="26"/>
+          <w:szCs w:val="26"/>
+          <w:rtl w:val="off"/>
+        </w:rPr>
+        <w:t>그 다음에는 편의성을 위해서 좌우 화살표를 입력시에 좌우로 이동하는 기능을 구현하기 위해서 키보드로 들어온 입력이 좌우 화살표인 경우에는 각각 vga.h에 정의된 함수를 가져와서 col값을 바꿔서 커서를 이동시켰다.</w:t>
+      </w:r>
+    </w:p>
+    <w:p>
+      <w:pPr>
+        <w:jc w:val="left"/>
+        <w:tabs>
+          <w:tab w:val="left" w:pos="7892"/>
+        </w:tabs>
+        <w:rPr>
+          <w:lang w:eastAsia="ko-KR"/>
+          <w:rFonts w:hint="eastAsia"/>
+          <w:b w:val="0"/>
+          <w:bCs w:val="0"/>
+          <w:sz w:val="26"/>
+          <w:szCs w:val="26"/>
+          <w:rtl w:val="off"/>
+        </w:rPr>
+      </w:pPr>
+    </w:p>
+    <w:p>
+      <w:pPr>
+        <w:jc w:val="left"/>
+        <w:tabs>
+          <w:tab w:val="left" w:pos="7892"/>
+        </w:tabs>
+        <w:rPr>
+          <w:lang w:eastAsia="ko-KR"/>
+          <w:rFonts w:hint="eastAsia"/>
+          <w:b w:val="0"/>
+          <w:bCs w:val="0"/>
+          <w:sz w:val="26"/>
+          <w:szCs w:val="26"/>
+          <w:rtl w:val="off"/>
+        </w:rPr>
+      </w:pPr>
+      <w:r>
+        <w:rPr>
+          <w:lang w:eastAsia="ko-KR"/>
+          <w:rFonts w:hint="eastAsia"/>
+          <w:b w:val="0"/>
+          <w:bCs w:val="0"/>
+          <w:sz w:val="26"/>
+          <w:szCs w:val="26"/>
+          <w:rtl w:val="off"/>
+        </w:rPr>
+        <w:t>이렇게 기본적인 키보드 입력에 따른 처리를 만들었지만 지금 현재로선 화면에 무슨 문자열이 있는지 커널이 알기에는 무리가 있다. 따라서 이를 관리할 버퍼와 인덱스 그리고 사용자 입력에 따라서 버퍼의 정보를 갱신해야 한다. 그러기 위해서 키보드 함수에서 이와 관련된 코드를 작성해서 사용자의 입력을 저장하고 상황에 따라 관리하게 했다.</w:t>
+      </w:r>
+    </w:p>
+    <w:p>
+      <w:pPr>
+        <w:jc w:val="left"/>
+        <w:tabs>
+          <w:tab w:val="left" w:pos="7892"/>
+        </w:tabs>
+        <w:rPr>
+          <w:lang w:eastAsia="ko-KR"/>
+          <w:rFonts w:hint="eastAsia"/>
+          <w:b w:val="0"/>
+          <w:bCs w:val="0"/>
+          <w:sz w:val="26"/>
+          <w:szCs w:val="26"/>
+          <w:rtl w:val="off"/>
+        </w:rPr>
+      </w:pPr>
+      <w:r>
+        <w:rPr>
+          <w:lang w:eastAsia="ko-KR"/>
+          <w:rFonts w:hint="eastAsia"/>
+          <w:b w:val="0"/>
+          <w:bCs w:val="0"/>
+          <w:sz w:val="26"/>
+          <w:szCs w:val="26"/>
+          <w:rtl w:val="off"/>
+        </w:rPr>
+        <w:t xml:space="preserve">  </w:t>
+      </w:r>
+      <w:r>
+        <w:rPr>
+          <w:lang w:eastAsia="ko-KR"/>
+          <w:rFonts w:hint="eastAsia"/>
+          <w:b w:val="0"/>
+          <w:bCs w:val="0"/>
+          <w:sz w:val="26"/>
+          <w:szCs w:val="26"/>
+          <w:rtl w:val="off"/>
+        </w:rPr>
+        <w:tab/>
+      </w:r>
+    </w:p>
+    <w:p>
+      <w:pPr>
+        <w:jc w:val="left"/>
+        <w:tabs>
+          <w:tab w:val="left" w:pos="7892"/>
+        </w:tabs>
+        <w:rPr>
+          <w:lang w:eastAsia="ko-KR"/>
+          <w:rFonts w:hint="eastAsia"/>
+          <w:b w:val="0"/>
+          <w:bCs w:val="0"/>
+          <w:sz w:val="26"/>
+          <w:szCs w:val="26"/>
+          <w:rtl w:val="off"/>
+        </w:rPr>
+      </w:pPr>
+      <w:r>
+        <w:rPr>
+          <w:lang w:eastAsia="ko-KR"/>
+          <w:rFonts w:hint="eastAsia"/>
+          <w:b w:val="0"/>
+          <w:bCs w:val="0"/>
+          <w:sz w:val="26"/>
+          <w:szCs w:val="26"/>
+          <w:rtl w:val="off"/>
+        </w:rPr>
+        <w:t>이제 버퍼를 만들었으니 사용자가 입력한 내용에 따라서 명령어를 실행하는 간단한 임시 쉘을 구현하려고 한다. 이를 위해서 먼저 shell.c,shell.h 파일을 만들고 그 다음에는keyboard.c파일과 연결해서 이 파일에 정적인 문자열 비교하는 함수와 미리 정해둔 명령어들과의 비교를 통해서 일치하면 명령어에 따른 행동을 출력하게 작성했다</w:t>
+      </w:r>
+    </w:p>
+    <w:p>
+      <w:pPr>
+        <w:jc w:val="left"/>
+        <w:tabs>
+          <w:tab w:val="left" w:pos="7892"/>
+        </w:tabs>
+        <w:rPr>
+          <w:lang w:eastAsia="ko-KR"/>
+          <w:rFonts w:hint="eastAsia"/>
+          <w:b w:val="0"/>
+          <w:bCs w:val="0"/>
+          <w:sz w:val="26"/>
+          <w:szCs w:val="26"/>
+          <w:rtl w:val="off"/>
+        </w:rPr>
+      </w:pPr>
+    </w:p>
+    <w:p>
+      <w:pPr>
+        <w:jc w:val="left"/>
+        <w:tabs>
+          <w:tab w:val="left" w:pos="7892"/>
+        </w:tabs>
+        <w:rPr>
+          <w:lang w:eastAsia="ko-KR"/>
+          <w:rFonts w:hint="eastAsia"/>
+          <w:b w:val="0"/>
+          <w:bCs w:val="0"/>
+          <w:sz w:val="26"/>
+          <w:szCs w:val="26"/>
+          <w:rtl w:val="off"/>
+        </w:rPr>
+      </w:pPr>
+      <w:r>
+        <w:rPr>
+          <w:lang w:eastAsia="ko-KR"/>
+          <w:rFonts w:hint="eastAsia"/>
+          <w:b w:val="0"/>
+          <w:bCs w:val="0"/>
+          <w:sz w:val="26"/>
+          <w:szCs w:val="26"/>
+          <w:rtl w:val="off"/>
+        </w:rPr>
+        <w:t>그 다음에는 키보드 인터럽트와 shell을 분리해서 irq발생시 이를 queue에 저장했다가 kernel에 보내면 kernel에서 shell을 통해서 처리하게 하려고 한다. 이를 위해 원형 큐를 만들고 irq핸들러의 역할을 최소화했고 입력 처리 함수를 분리한 다음에 kernel 메인 루프와 연결했다.</w:t>
+      </w:r>
+    </w:p>
+    <w:p>
+      <w:pPr>
+        <w:jc w:val="left"/>
+        <w:tabs>
+          <w:tab w:val="left" w:pos="7892"/>
+        </w:tabs>
+        <w:rPr>
+          <w:lang w:eastAsia="ko-KR"/>
+          <w:rFonts w:hint="eastAsia"/>
+          <w:b w:val="0"/>
+          <w:bCs w:val="0"/>
+          <w:sz w:val="26"/>
+          <w:szCs w:val="26"/>
+          <w:rtl w:val="off"/>
+        </w:rPr>
+      </w:pPr>
+    </w:p>
+    <w:p>
+      <w:pPr>
+        <w:jc w:val="left"/>
+        <w:tabs>
+          <w:tab w:val="left" w:pos="7892"/>
+        </w:tabs>
+        <w:rPr>
+          <w:lang w:eastAsia="ko-KR"/>
+          <w:rFonts w:hint="eastAsia"/>
+          <w:b w:val="0"/>
+          <w:bCs w:val="0"/>
+          <w:sz w:val="26"/>
+          <w:szCs w:val="26"/>
+          <w:rtl w:val="off"/>
+        </w:rPr>
+      </w:pPr>
+    </w:p>
+    <w:p>
+      <w:pPr>
+        <w:jc w:val="left"/>
+        <w:tabs>
+          <w:tab w:val="left" w:pos="7892"/>
+        </w:tabs>
+        <w:rPr>
+          <w:lang w:eastAsia="ko-KR"/>
+          <w:rFonts w:hint="eastAsia"/>
+          <w:b w:val="0"/>
+          <w:bCs w:val="0"/>
+          <w:sz w:val="26"/>
+          <w:szCs w:val="26"/>
+          <w:rtl w:val="off"/>
+        </w:rPr>
+      </w:pPr>
+    </w:p>
+    <w:p>
+      <w:pPr>
+        <w:jc w:val="left"/>
+        <w:tabs>
+          <w:tab w:val="left" w:pos="7892"/>
+        </w:tabs>
+        <w:rPr>
+          <w:lang w:eastAsia="ko-KR"/>
+          <w:rFonts w:hint="eastAsia"/>
+          <w:b w:val="0"/>
+          <w:bCs w:val="0"/>
+          <w:sz w:val="26"/>
+          <w:szCs w:val="26"/>
+          <w:rtl w:val="off"/>
+        </w:rPr>
+      </w:pPr>
+      <w:r>
+        <w:rPr>
+          <w:lang w:eastAsia="ko-KR"/>
+          <w:rFonts w:hint="eastAsia"/>
+          <w:b w:val="0"/>
+          <w:bCs w:val="0"/>
+          <w:sz w:val="26"/>
+          <w:szCs w:val="26"/>
+          <w:rtl w:val="off"/>
+        </w:rPr>
+        <w:t>그 다음에는 입력 처리함수에</w:t>
+      </w:r>
     </w:p>
     <w:p>
       <w:pPr>
@@ -23867,22 +24256,22 @@
     <w:lsdException w:name="index 7" w:semiHidden="1" w:unhideWhenUsed="1"/>
     <w:lsdException w:name="index 8" w:semiHidden="1" w:unhideWhenUsed="1"/>
     <w:lsdException w:name="index 9" w:semiHidden="1" w:unhideWhenUsed="1"/>
-    <w:lsdException w:name="toc 1" w:semiHidden="1" w:uiPriority="1075188599" w:unhideWhenUsed="1"/>
-    <w:lsdException w:name="toc 2" w:semiHidden="1" w:uiPriority="1075188599" w:unhideWhenUsed="1"/>
-    <w:lsdException w:name="toc 3" w:semiHidden="1" w:uiPriority="1075188599" w:unhideWhenUsed="1"/>
-    <w:lsdException w:name="toc 4" w:semiHidden="1" w:uiPriority="1075188599" w:unhideWhenUsed="1"/>
-    <w:lsdException w:name="toc 5" w:semiHidden="1" w:uiPriority="1075188599" w:unhideWhenUsed="1"/>
-    <w:lsdException w:name="toc 6" w:semiHidden="1" w:uiPriority="1075188599" w:unhideWhenUsed="1"/>
-    <w:lsdException w:name="toc 7" w:semiHidden="1" w:uiPriority="1075188599" w:unhideWhenUsed="1"/>
-    <w:lsdException w:name="toc 8" w:semiHidden="1" w:uiPriority="1075188599" w:unhideWhenUsed="1"/>
-    <w:lsdException w:name="toc 9" w:semiHidden="1" w:uiPriority="1075188599" w:unhideWhenUsed="1"/>
+    <w:lsdException w:name="toc 1" w:semiHidden="1" w:uiPriority="-2094852797" w:unhideWhenUsed="1"/>
+    <w:lsdException w:name="toc 2" w:semiHidden="1" w:uiPriority="-2094852797" w:unhideWhenUsed="1"/>
+    <w:lsdException w:name="toc 3" w:semiHidden="1" w:uiPriority="-2094852797" w:unhideWhenUsed="1"/>
+    <w:lsdException w:name="toc 4" w:semiHidden="1" w:uiPriority="-2094852797" w:unhideWhenUsed="1"/>
+    <w:lsdException w:name="toc 5" w:semiHidden="1" w:uiPriority="-2094852797" w:unhideWhenUsed="1"/>
+    <w:lsdException w:name="toc 6" w:semiHidden="1" w:uiPriority="-2094852797" w:unhideWhenUsed="1"/>
+    <w:lsdException w:name="toc 7" w:semiHidden="1" w:uiPriority="-2094852797" w:unhideWhenUsed="1"/>
+    <w:lsdException w:name="toc 8" w:semiHidden="1" w:uiPriority="-2094852797" w:unhideWhenUsed="1"/>
+    <w:lsdException w:name="toc 9" w:semiHidden="1" w:uiPriority="-2094852797" w:unhideWhenUsed="1"/>
     <w:lsdException w:name="Normal Indent" w:semiHidden="1" w:unhideWhenUsed="1"/>
     <w:lsdException w:name="footnote text" w:semiHidden="1" w:unhideWhenUsed="1"/>
     <w:lsdException w:name="annotation text" w:semiHidden="1" w:unhideWhenUsed="1"/>
     <w:lsdException w:name="header" w:semiHidden="1" w:unhideWhenUsed="1"/>
     <w:lsdException w:name="footer" w:semiHidden="1" w:unhideWhenUsed="1"/>
     <w:lsdException w:name="index heading" w:semiHidden="1" w:unhideWhenUsed="1"/>
-    <w:lsdException w:name="caption" w:semiHidden="1" w:uiPriority="-2042199015" w:unhideWhenUsed="1" w:qFormat="1"/>
+    <w:lsdException w:name="caption" w:semiHidden="1" w:uiPriority="-1142001925" w:unhideWhenUsed="1" w:qFormat="1"/>
     <w:lsdException w:name="table of figures" w:semiHidden="1" w:unhideWhenUsed="1"/>
     <w:lsdException w:name="envelope address" w:semiHidden="1" w:unhideWhenUsed="1"/>
     <w:lsdException w:name="envelope return" w:semiHidden="1" w:unhideWhenUsed="1"/>
@@ -23910,7 +24299,7 @@
     <w:lsdException w:name="List Number 3" w:semiHidden="1" w:unhideWhenUsed="1"/>
     <w:lsdException w:name="List Number 4" w:semiHidden="1" w:unhideWhenUsed="1"/>
     <w:lsdException w:name="List Number 5" w:semiHidden="1" w:unhideWhenUsed="1"/>
-    <w:lsdException w:name="Title" w:uiPriority="53909256" w:qFormat="1"/>
+    <w:lsdException w:name="Title" w:uiPriority="645210994" w:qFormat="1"/>
     <w:lsdException w:name="Closing" w:semiHidden="1" w:unhideWhenUsed="1"/>
     <w:lsdException w:name="Signature" w:semiHidden="1" w:unhideWhenUsed="1"/>
     <w:lsdException w:name="Default Paragraph Font" w:semiHidden="1" w:uiPriority="1" w:unhideWhenUsed="1"/>
@@ -23922,7 +24311,7 @@
     <w:lsdException w:name="List Continue 4" w:semiHidden="1" w:unhideWhenUsed="1"/>
     <w:lsdException w:name="List Continue 5" w:semiHidden="1" w:unhideWhenUsed="1"/>
     <w:lsdException w:name="Message Header" w:semiHidden="1" w:unhideWhenUsed="1"/>
-    <w:lsdException w:name="Subtitle" w:uiPriority="122046757" w:qFormat="1"/>
+    <w:lsdException w:name="Subtitle" w:uiPriority="-2042199015" w:qFormat="1"/>
     <w:lsdException w:name="Salutation" w:semiHidden="1" w:unhideWhenUsed="1"/>
     <w:lsdException w:name="Date" w:semiHidden="1" w:unhideWhenUsed="1"/>
     <w:lsdException w:name="Body Text First Indent" w:semiHidden="1" w:unhideWhenUsed="1"/>
@@ -23935,8 +24324,8 @@
     <w:lsdException w:name="Block Text" w:semiHidden="1" w:unhideWhenUsed="1"/>
     <w:lsdException w:name="Hyperlink" w:semiHidden="1" w:unhideWhenUsed="1"/>
     <w:lsdException w:name="FollowedHyperlink" w:semiHidden="1" w:unhideWhenUsed="1"/>
-    <w:lsdException w:name="Strong" w:uiPriority="26752372" w:qFormat="1"/>
-    <w:lsdException w:name="Emphasis" w:uiPriority="1114665480" w:qFormat="1"/>
+    <w:lsdException w:name="Strong" w:uiPriority="1501114436" w:qFormat="1"/>
+    <w:lsdException w:name="Emphasis" w:uiPriority="158475872" w:qFormat="1"/>
     <w:lsdException w:name="Document Map" w:semiHidden="1" w:unhideWhenUsed="1"/>
     <w:lsdException w:name="Plain Text" w:semiHidden="1" w:unhideWhenUsed="1"/>
     <w:lsdException w:name="E-mail Signature" w:semiHidden="1" w:unhideWhenUsed="1"/>
@@ -24002,223 +24391,223 @@
     <w:lsdException w:name="Table Web 2" w:semiHidden="1" w:unhideWhenUsed="1"/>
     <w:lsdException w:name="Table Web 3" w:semiHidden="1" w:unhideWhenUsed="1"/>
     <w:lsdException w:name="Balloon Text" w:semiHidden="1" w:unhideWhenUsed="1"/>
-    <w:lsdException w:name="Table Grid" w:uiPriority="1075188599"/>
+    <w:lsdException w:name="Table Grid" w:uiPriority="-2094852797"/>
     <w:lsdException w:name="Table Theme" w:semiHidden="1" w:unhideWhenUsed="1"/>
     <w:lsdException w:name="Placeholder Text" w:semiHidden="1"/>
     <w:lsdException w:name="No Spacing" w:uiPriority="1" w:qFormat="1"/>
-    <w:lsdException w:name="Light Shading" w:uiPriority="-1764193682"/>
-    <w:lsdException w:name="Light List" w:uiPriority="-1721014645"/>
-    <w:lsdException w:name="Light Grid" w:uiPriority="-811033174"/>
-    <w:lsdException w:name="Medium Shading 1" w:uiPriority="-811033161"/>
-    <w:lsdException w:name="Medium Shading 2" w:uiPriority="-9840244"/>
-    <w:lsdException w:name="Medium List 1" w:uiPriority="-9011589"/>
-    <w:lsdException w:name="Medium List 2" w:uiPriority="2032374898"/>
-    <w:lsdException w:name="Medium Grid 1" w:uiPriority="2032374899"/>
-    <w:lsdException w:name="Medium Grid 2" w:uiPriority="-965755538"/>
-    <w:lsdException w:name="Medium Grid 3" w:uiPriority="-965750857"/>
-    <w:lsdException w:name="Dark List" w:uiPriority="561336370"/>
-    <w:lsdException w:name="Colorful Shading" w:uiPriority="561349961"/>
-    <w:lsdException w:name="Colorful List" w:uiPriority="1495540232"/>
-    <w:lsdException w:name="Colorful Grid" w:uiPriority="1495540551"/>
-    <w:lsdException w:name="Light Shading Accent 1" w:uiPriority="-1764193682"/>
-    <w:lsdException w:name="Light List Accent 1" w:uiPriority="-1721014645"/>
-    <w:lsdException w:name="Light Grid Accent 1" w:uiPriority="-811033174"/>
-    <w:lsdException w:name="Medium Shading 1 Accent 1" w:uiPriority="-811033161"/>
-    <w:lsdException w:name="Medium Shading 2 Accent 1" w:uiPriority="-9840244"/>
-    <w:lsdException w:name="Medium List 1 Accent 1" w:uiPriority="-9011589"/>
+    <w:lsdException w:name="Light Shading" w:uiPriority="-862331538"/>
+    <w:lsdException w:name="Light List" w:uiPriority="-332419"/>
+    <w:lsdException w:name="Light Grid" w:uiPriority="1495684904"/>
+    <w:lsdException w:name="Medium Shading 1" w:uiPriority="1495684953"/>
+    <w:lsdException w:name="Medium Shading 2" w:uiPriority="1720381392"/>
+    <w:lsdException w:name="Medium List 1" w:uiPriority="-1496778307"/>
+    <w:lsdException w:name="Medium List 2" w:uiPriority="302158468"/>
+    <w:lsdException w:name="Medium Grid 1" w:uiPriority="302158469"/>
+    <w:lsdException w:name="Medium Grid 2" w:uiPriority="-890636544"/>
+    <w:lsdException w:name="Medium Grid 3" w:uiPriority="-889390631"/>
+    <w:lsdException w:name="Dark List" w:uiPriority="318785042"/>
+    <w:lsdException w:name="Colorful Shading" w:uiPriority="328336275"/>
+    <w:lsdException w:name="Colorful List" w:uiPriority="-1987824012"/>
+    <w:lsdException w:name="Colorful Grid" w:uiPriority="-1987808681"/>
+    <w:lsdException w:name="Light Shading Accent 1" w:uiPriority="-862331538"/>
+    <w:lsdException w:name="Light List Accent 1" w:uiPriority="-332419"/>
+    <w:lsdException w:name="Light Grid Accent 1" w:uiPriority="1495684904"/>
+    <w:lsdException w:name="Medium Shading 1 Accent 1" w:uiPriority="1495684953"/>
+    <w:lsdException w:name="Medium Shading 2 Accent 1" w:uiPriority="1720381392"/>
+    <w:lsdException w:name="Medium List 1 Accent 1" w:uiPriority="-1496778307"/>
     <w:lsdException w:name="Revision" w:semiHidden="1"/>
-    <w:lsdException w:name="List Paragraph" w:uiPriority="645210994" w:qFormat="1"/>
-    <w:lsdException w:name="Quote" w:uiPriority="-277434889" w:qFormat="1"/>
-    <w:lsdException w:name="Intense Quote" w:uiPriority="-1985427520" w:qFormat="1"/>
-    <w:lsdException w:name="Medium List 2 Accent 1" w:uiPriority="2032374898"/>
-    <w:lsdException w:name="Medium Grid 1 Accent 1" w:uiPriority="2032374899"/>
-    <w:lsdException w:name="Medium Grid 2 Accent 1" w:uiPriority="-965755538"/>
-    <w:lsdException w:name="Medium Grid 3 Accent 1" w:uiPriority="-965750857"/>
-    <w:lsdException w:name="Dark List Accent 1" w:uiPriority="561336370"/>
-    <w:lsdException w:name="Colorful Shading Accent 1" w:uiPriority="561349961"/>
-    <w:lsdException w:name="Colorful List Accent 1" w:uiPriority="1495540232"/>
-    <w:lsdException w:name="Colorful Grid Accent 1" w:uiPriority="1495540551"/>
-    <w:lsdException w:name="Light Shading Accent 2" w:uiPriority="-1764193682"/>
-    <w:lsdException w:name="Light List Accent 2" w:uiPriority="-1721014645"/>
-    <w:lsdException w:name="Light Grid Accent 2" w:uiPriority="-811033174"/>
-    <w:lsdException w:name="Medium Shading 1 Accent 2" w:uiPriority="-811033161"/>
-    <w:lsdException w:name="Medium Shading 2 Accent 2" w:uiPriority="-9840244"/>
-    <w:lsdException w:name="Medium List 1 Accent 2" w:uiPriority="-9011589"/>
-    <w:lsdException w:name="Medium List 2 Accent 2" w:uiPriority="2032374898"/>
-    <w:lsdException w:name="Medium Grid 1 Accent 2" w:uiPriority="2032374899"/>
-    <w:lsdException w:name="Medium Grid 2 Accent 2" w:uiPriority="-965755538"/>
-    <w:lsdException w:name="Medium Grid 3 Accent 2" w:uiPriority="-965750857"/>
-    <w:lsdException w:name="Dark List Accent 2" w:uiPriority="561336370"/>
-    <w:lsdException w:name="Colorful Shading Accent 2" w:uiPriority="561349961"/>
-    <w:lsdException w:name="Colorful List Accent 2" w:uiPriority="1495540232"/>
-    <w:lsdException w:name="Colorful Grid Accent 2" w:uiPriority="1495540551"/>
-    <w:lsdException w:name="Light Shading Accent 3" w:uiPriority="-1764193682"/>
-    <w:lsdException w:name="Light List Accent 3" w:uiPriority="-1721014645"/>
-    <w:lsdException w:name="Light Grid Accent 3" w:uiPriority="-811033174"/>
-    <w:lsdException w:name="Medium Shading 1 Accent 3" w:uiPriority="-811033161"/>
-    <w:lsdException w:name="Medium Shading 2 Accent 3" w:uiPriority="-9840244"/>
-    <w:lsdException w:name="Medium List 1 Accent 3" w:uiPriority="-9011589"/>
-    <w:lsdException w:name="Medium List 2 Accent 3" w:uiPriority="2032374898"/>
-    <w:lsdException w:name="Medium Grid 1 Accent 3" w:uiPriority="2032374899"/>
-    <w:lsdException w:name="Medium Grid 2 Accent 3" w:uiPriority="-965755538"/>
-    <w:lsdException w:name="Medium Grid 3 Accent 3" w:uiPriority="-965750857"/>
-    <w:lsdException w:name="Dark List Accent 3" w:uiPriority="561336370"/>
-    <w:lsdException w:name="Colorful Shading Accent 3" w:uiPriority="561349961"/>
-    <w:lsdException w:name="Colorful List Accent 3" w:uiPriority="1495540232"/>
-    <w:lsdException w:name="Colorful Grid Accent 3" w:uiPriority="1495540551"/>
-    <w:lsdException w:name="Light Shading Accent 4" w:uiPriority="-1764193682"/>
-    <w:lsdException w:name="Light List Accent 4" w:uiPriority="-1721014645"/>
-    <w:lsdException w:name="Light Grid Accent 4" w:uiPriority="-811033174"/>
-    <w:lsdException w:name="Medium Shading 1 Accent 4" w:uiPriority="-811033161"/>
-    <w:lsdException w:name="Medium Shading 2 Accent 4" w:uiPriority="-9840244"/>
-    <w:lsdException w:name="Medium List 1 Accent 4" w:uiPriority="-9011589"/>
-    <w:lsdException w:name="Medium List 2 Accent 4" w:uiPriority="2032374898"/>
-    <w:lsdException w:name="Medium Grid 1 Accent 4" w:uiPriority="2032374899"/>
-    <w:lsdException w:name="Medium Grid 2 Accent 4" w:uiPriority="-965755538"/>
-    <w:lsdException w:name="Medium Grid 3 Accent 4" w:uiPriority="-965750857"/>
-    <w:lsdException w:name="Dark List Accent 4" w:uiPriority="561336370"/>
-    <w:lsdException w:name="Colorful Shading Accent 4" w:uiPriority="561349961"/>
-    <w:lsdException w:name="Colorful List Accent 4" w:uiPriority="1495540232"/>
-    <w:lsdException w:name="Colorful Grid Accent 4" w:uiPriority="1495540551"/>
-    <w:lsdException w:name="Light Shading Accent 5" w:uiPriority="-1764193682"/>
-    <w:lsdException w:name="Light List Accent 5" w:uiPriority="-1721014645"/>
-    <w:lsdException w:name="Light Grid Accent 5" w:uiPriority="-811033174"/>
-    <w:lsdException w:name="Medium Shading 1 Accent 5" w:uiPriority="-811033161"/>
-    <w:lsdException w:name="Medium Shading 2 Accent 5" w:uiPriority="-9840244"/>
-    <w:lsdException w:name="Medium List 1 Accent 5" w:uiPriority="-9011589"/>
-    <w:lsdException w:name="Medium List 2 Accent 5" w:uiPriority="2032374898"/>
-    <w:lsdException w:name="Medium Grid 1 Accent 5" w:uiPriority="2032374899"/>
-    <w:lsdException w:name="Medium Grid 2 Accent 5" w:uiPriority="-965755538"/>
-    <w:lsdException w:name="Medium Grid 3 Accent 5" w:uiPriority="-965750857"/>
-    <w:lsdException w:name="Dark List Accent 5" w:uiPriority="561336370"/>
-    <w:lsdException w:name="Colorful Shading Accent 5" w:uiPriority="561349961"/>
-    <w:lsdException w:name="Colorful List Accent 5" w:uiPriority="1495540232"/>
-    <w:lsdException w:name="Colorful Grid Accent 5" w:uiPriority="1495540551"/>
-    <w:lsdException w:name="Light Shading Accent 6" w:uiPriority="-1764193682"/>
-    <w:lsdException w:name="Light List Accent 6" w:uiPriority="-1721014645"/>
-    <w:lsdException w:name="Light Grid Accent 6" w:uiPriority="-811033174"/>
-    <w:lsdException w:name="Medium Shading 1 Accent 6" w:uiPriority="-811033161"/>
-    <w:lsdException w:name="Medium Shading 2 Accent 6" w:uiPriority="-9840244"/>
-    <w:lsdException w:name="Medium List 1 Accent 6" w:uiPriority="-9011589"/>
-    <w:lsdException w:name="Medium List 2 Accent 6" w:uiPriority="2032374898"/>
-    <w:lsdException w:name="Medium Grid 1 Accent 6" w:uiPriority="2032374899"/>
-    <w:lsdException w:name="Medium Grid 2 Accent 6" w:uiPriority="-965755538"/>
-    <w:lsdException w:name="Medium Grid 3 Accent 6" w:uiPriority="-965750857"/>
-    <w:lsdException w:name="Dark List Accent 6" w:uiPriority="561336370"/>
-    <w:lsdException w:name="Colorful Shading Accent 6" w:uiPriority="561349961"/>
-    <w:lsdException w:name="Colorful List Accent 6" w:uiPriority="1495540232"/>
-    <w:lsdException w:name="Colorful Grid Accent 6" w:uiPriority="1495540551"/>
-    <w:lsdException w:name="Subtle Emphasis" w:uiPriority="570789929" w:qFormat="1"/>
-    <w:lsdException w:name="Intense Emphasis" w:uiPriority="359937561" w:qFormat="1"/>
-    <w:lsdException w:name="Subtle Reference" w:uiPriority="-1985427495" w:qFormat="1"/>
-    <w:lsdException w:name="Intense Reference" w:uiPriority="342250624" w:qFormat="1"/>
-    <w:lsdException w:name="Book Title" w:uiPriority="1502836065" w:qFormat="1"/>
-    <w:lsdException w:name="Bibliography" w:semiHidden="1" w:uiPriority="-2037049567" w:unhideWhenUsed="1"/>
-    <w:lsdException w:name="TOC Heading" w:semiHidden="1" w:uiPriority="1075188599" w:unhideWhenUsed="1" w:qFormat="1"/>
-    <w:lsdException w:name="Plain Table 1" w:uiPriority="-2000898185"/>
-    <w:lsdException w:name="Plain Table 2" w:uiPriority="1679239472"/>
-    <w:lsdException w:name="Plain Table 3" w:uiPriority="1679239473"/>
-    <w:lsdException w:name="Plain Table 4" w:uiPriority="-339904292"/>
-    <w:lsdException w:name="Plain Table 5" w:uiPriority="-339903049"/>
-    <w:lsdException w:name="Grid Table Light" w:uiPriority="-2000962674"/>
-    <w:lsdException w:name="Grid Table 1 Light" w:uiPriority="2021755032"/>
-    <w:lsdException w:name="Grid Table 2" w:uiPriority="2021758549"/>
-    <w:lsdException w:name="Grid Table 3" w:uiPriority="2059242208"/>
-    <w:lsdException w:name="Grid Table 4" w:uiPriority="2059242347"/>
-    <w:lsdException w:name="Grid Table 5 Dark" w:uiPriority="1109722660"/>
-    <w:lsdException w:name="Grid Table 6 Colorful" w:uiPriority="42164325"/>
-    <w:lsdException w:name="Grid Table 7 Colorful" w:uiPriority="1159793044"/>
-    <w:lsdException w:name="Grid Table 1 Light Accent 1" w:uiPriority="2021755032"/>
-    <w:lsdException w:name="Grid Table 2 Accent 1" w:uiPriority="2021758549"/>
-    <w:lsdException w:name="Grid Table 3 Accent 1" w:uiPriority="2059242208"/>
-    <w:lsdException w:name="Grid Table 4 Accent 1" w:uiPriority="2059242347"/>
-    <w:lsdException w:name="Grid Table 5 Dark Accent 1" w:uiPriority="1109722660"/>
-    <w:lsdException w:name="Grid Table 6 Colorful Accent 1" w:uiPriority="42164325"/>
-    <w:lsdException w:name="Grid Table 7 Colorful Accent 1" w:uiPriority="1159793044"/>
-    <w:lsdException w:name="Grid Table 1 Light Accent 2" w:uiPriority="2021755032"/>
-    <w:lsdException w:name="Grid Table 2 Accent 2" w:uiPriority="2021758549"/>
-    <w:lsdException w:name="Grid Table 3 Accent 2" w:uiPriority="2059242208"/>
-    <w:lsdException w:name="Grid Table 4 Accent 2" w:uiPriority="2059242347"/>
-    <w:lsdException w:name="Grid Table 5 Dark Accent 2" w:uiPriority="1109722660"/>
-    <w:lsdException w:name="Grid Table 6 Colorful Accent 2" w:uiPriority="42164325"/>
-    <w:lsdException w:name="Grid Table 7 Colorful Accent 2" w:uiPriority="1159793044"/>
-    <w:lsdException w:name="Grid Table 1 Light Accent 3" w:uiPriority="2021755032"/>
-    <w:lsdException w:name="Grid Table 2 Accent 3" w:uiPriority="2021758549"/>
-    <w:lsdException w:name="Grid Table 3 Accent 3" w:uiPriority="2059242208"/>
-    <w:lsdException w:name="Grid Table 4 Accent 3" w:uiPriority="2059242347"/>
-    <w:lsdException w:name="Grid Table 5 Dark Accent 3" w:uiPriority="1109722660"/>
-    <w:lsdException w:name="Grid Table 6 Colorful Accent 3" w:uiPriority="42164325"/>
-    <w:lsdException w:name="Grid Table 7 Colorful Accent 3" w:uiPriority="1159793044"/>
-    <w:lsdException w:name="Grid Table 1 Light Accent 4" w:uiPriority="2021755032"/>
-    <w:lsdException w:name="Grid Table 2 Accent 4" w:uiPriority="2021758549"/>
-    <w:lsdException w:name="Grid Table 3 Accent 4" w:uiPriority="2059242208"/>
-    <w:lsdException w:name="Grid Table 4 Accent 4" w:uiPriority="2059242347"/>
-    <w:lsdException w:name="Grid Table 5 Dark Accent 4" w:uiPriority="1109722660"/>
-    <w:lsdException w:name="Grid Table 6 Colorful Accent 4" w:uiPriority="42164325"/>
-    <w:lsdException w:name="Grid Table 7 Colorful Accent 4" w:uiPriority="1159793044"/>
-    <w:lsdException w:name="Grid Table 1 Light Accent 5" w:uiPriority="2021755032"/>
-    <w:lsdException w:name="Grid Table 2 Accent 5" w:uiPriority="2021758549"/>
-    <w:lsdException w:name="Grid Table 3 Accent 5" w:uiPriority="2059242208"/>
-    <w:lsdException w:name="Grid Table 4 Accent 5" w:uiPriority="2059242347"/>
-    <w:lsdException w:name="Grid Table 5 Dark Accent 5" w:uiPriority="1109722660"/>
-    <w:lsdException w:name="Grid Table 6 Colorful Accent 5" w:uiPriority="42164325"/>
-    <w:lsdException w:name="Grid Table 7 Colorful Accent 5" w:uiPriority="1159793044"/>
-    <w:lsdException w:name="Grid Table 1 Light Accent 6" w:uiPriority="2021755032"/>
-    <w:lsdException w:name="Grid Table 2 Accent 6" w:uiPriority="2021758549"/>
-    <w:lsdException w:name="Grid Table 3 Accent 6" w:uiPriority="2059242208"/>
-    <w:lsdException w:name="Grid Table 4 Accent 6" w:uiPriority="2059242347"/>
-    <w:lsdException w:name="Grid Table 5 Dark Accent 6" w:uiPriority="1109722660"/>
-    <w:lsdException w:name="Grid Table 6 Colorful Accent 6" w:uiPriority="42164325"/>
-    <w:lsdException w:name="Grid Table 7 Colorful Accent 6" w:uiPriority="1159793044"/>
-    <w:lsdException w:name="List Table 1 Light" w:uiPriority="2021755032"/>
-    <w:lsdException w:name="List Table 2" w:uiPriority="2021758549"/>
-    <w:lsdException w:name="List Table 3" w:uiPriority="2059242208"/>
-    <w:lsdException w:name="List Table 4" w:uiPriority="2059242347"/>
-    <w:lsdException w:name="List Table 5 Dark" w:uiPriority="1109722660"/>
-    <w:lsdException w:name="List Table 6 Colorful" w:uiPriority="42164325"/>
-    <w:lsdException w:name="List Table 7 Colorful" w:uiPriority="1159793044"/>
-    <w:lsdException w:name="List Table 1 Light Accent 1" w:uiPriority="2021755032"/>
-    <w:lsdException w:name="List Table 2 Accent 1" w:uiPriority="2021758549"/>
-    <w:lsdException w:name="List Table 3 Accent 1" w:uiPriority="2059242208"/>
-    <w:lsdException w:name="List Table 4 Accent 1" w:uiPriority="2059242347"/>
-    <w:lsdException w:name="List Table 5 Dark Accent 1" w:uiPriority="1109722660"/>
-    <w:lsdException w:name="List Table 6 Colorful Accent 1" w:uiPriority="42164325"/>
-    <w:lsdException w:name="List Table 7 Colorful Accent 1" w:uiPriority="1159793044"/>
-    <w:lsdException w:name="List Table 1 Light Accent 2" w:uiPriority="2021755032"/>
-    <w:lsdException w:name="List Table 2 Accent 2" w:uiPriority="2021758549"/>
-    <w:lsdException w:name="List Table 3 Accent 2" w:uiPriority="2059242208"/>
-    <w:lsdException w:name="List Table 4 Accent 2" w:uiPriority="2059242347"/>
-    <w:lsdException w:name="List Table 5 Dark Accent 2" w:uiPriority="1109722660"/>
-    <w:lsdException w:name="List Table 6 Colorful Accent 2" w:uiPriority="42164325"/>
-    <w:lsdException w:name="List Table 7 Colorful Accent 2" w:uiPriority="1159793044"/>
-    <w:lsdException w:name="List Table 1 Light Accent 3" w:uiPriority="2021755032"/>
-    <w:lsdException w:name="List Table 2 Accent 3" w:uiPriority="2021758549"/>
-    <w:lsdException w:name="List Table 3 Accent 3" w:uiPriority="2059242208"/>
-    <w:lsdException w:name="List Table 4 Accent 3" w:uiPriority="2059242347"/>
-    <w:lsdException w:name="List Table 5 Dark Accent 3" w:uiPriority="1109722660"/>
-    <w:lsdException w:name="List Table 6 Colorful Accent 3" w:uiPriority="42164325"/>
-    <w:lsdException w:name="List Table 7 Colorful Accent 3" w:uiPriority="1159793044"/>
-    <w:lsdException w:name="List Table 1 Light Accent 4" w:uiPriority="2021755032"/>
-    <w:lsdException w:name="List Table 2 Accent 4" w:uiPriority="2021758549"/>
-    <w:lsdException w:name="List Table 3 Accent 4" w:uiPriority="2059242208"/>
-    <w:lsdException w:name="List Table 4 Accent 4" w:uiPriority="2059242347"/>
-    <w:lsdException w:name="List Table 5 Dark Accent 4" w:uiPriority="1109722660"/>
-    <w:lsdException w:name="List Table 6 Colorful Accent 4" w:uiPriority="42164325"/>
-    <w:lsdException w:name="List Table 7 Colorful Accent 4" w:uiPriority="1159793044"/>
-    <w:lsdException w:name="List Table 1 Light Accent 5" w:uiPriority="2021755032"/>
-    <w:lsdException w:name="List Table 2 Accent 5" w:uiPriority="2021758549"/>
-    <w:lsdException w:name="List Table 3 Accent 5" w:uiPriority="2059242208"/>
-    <w:lsdException w:name="List Table 4 Accent 5" w:uiPriority="2059242347"/>
-    <w:lsdException w:name="List Table 5 Dark Accent 5" w:uiPriority="1109722660"/>
-    <w:lsdException w:name="List Table 6 Colorful Accent 5" w:uiPriority="42164325"/>
-    <w:lsdException w:name="List Table 7 Colorful Accent 5" w:uiPriority="1159793044"/>
-    <w:lsdException w:name="List Table 1 Light Accent 6" w:uiPriority="2021755032"/>
-    <w:lsdException w:name="List Table 2 Accent 6" w:uiPriority="2021758549"/>
-    <w:lsdException w:name="List Table 3 Accent 6" w:uiPriority="2059242208"/>
-    <w:lsdException w:name="List Table 4 Accent 6" w:uiPriority="2059242347"/>
-    <w:lsdException w:name="List Table 5 Dark Accent 6" w:uiPriority="1109722660"/>
-    <w:lsdException w:name="List Table 6 Colorful Accent 6" w:uiPriority="42164325"/>
-    <w:lsdException w:name="List Table 7 Colorful Accent 6" w:uiPriority="1159793044"/>
+    <w:lsdException w:name="List Paragraph" w:uiPriority="17908790" w:qFormat="1"/>
+    <w:lsdException w:name="Quote" w:uiPriority="-151065993" w:qFormat="1"/>
+    <w:lsdException w:name="Intense Quote" w:uiPriority="-1789656526" w:qFormat="1"/>
+    <w:lsdException w:name="Medium List 2 Accent 1" w:uiPriority="302158468"/>
+    <w:lsdException w:name="Medium Grid 1 Accent 1" w:uiPriority="302158469"/>
+    <w:lsdException w:name="Medium Grid 2 Accent 1" w:uiPriority="-890636544"/>
+    <w:lsdException w:name="Medium Grid 3 Accent 1" w:uiPriority="-889390631"/>
+    <w:lsdException w:name="Dark List Accent 1" w:uiPriority="318785042"/>
+    <w:lsdException w:name="Colorful Shading Accent 1" w:uiPriority="328336275"/>
+    <w:lsdException w:name="Colorful List Accent 1" w:uiPriority="-1987824012"/>
+    <w:lsdException w:name="Colorful Grid Accent 1" w:uiPriority="-1987808681"/>
+    <w:lsdException w:name="Light Shading Accent 2" w:uiPriority="-862331538"/>
+    <w:lsdException w:name="Light List Accent 2" w:uiPriority="-332419"/>
+    <w:lsdException w:name="Light Grid Accent 2" w:uiPriority="1495684904"/>
+    <w:lsdException w:name="Medium Shading 1 Accent 2" w:uiPriority="1495684953"/>
+    <w:lsdException w:name="Medium Shading 2 Accent 2" w:uiPriority="1720381392"/>
+    <w:lsdException w:name="Medium List 1 Accent 2" w:uiPriority="-1496778307"/>
+    <w:lsdException w:name="Medium List 2 Accent 2" w:uiPriority="302158468"/>
+    <w:lsdException w:name="Medium Grid 1 Accent 2" w:uiPriority="302158469"/>
+    <w:lsdException w:name="Medium Grid 2 Accent 2" w:uiPriority="-890636544"/>
+    <w:lsdException w:name="Medium Grid 3 Accent 2" w:uiPriority="-889390631"/>
+    <w:lsdException w:name="Dark List Accent 2" w:uiPriority="318785042"/>
+    <w:lsdException w:name="Colorful Shading Accent 2" w:uiPriority="328336275"/>
+    <w:lsdException w:name="Colorful List Accent 2" w:uiPriority="-1987824012"/>
+    <w:lsdException w:name="Colorful Grid Accent 2" w:uiPriority="-1987808681"/>
+    <w:lsdException w:name="Light Shading Accent 3" w:uiPriority="-862331538"/>
+    <w:lsdException w:name="Light List Accent 3" w:uiPriority="-332419"/>
+    <w:lsdException w:name="Light Grid Accent 3" w:uiPriority="1495684904"/>
+    <w:lsdException w:name="Medium Shading 1 Accent 3" w:uiPriority="1495684953"/>
+    <w:lsdException w:name="Medium Shading 2 Accent 3" w:uiPriority="1720381392"/>
+    <w:lsdException w:name="Medium List 1 Accent 3" w:uiPriority="-1496778307"/>
+    <w:lsdException w:name="Medium List 2 Accent 3" w:uiPriority="302158468"/>
+    <w:lsdException w:name="Medium Grid 1 Accent 3" w:uiPriority="302158469"/>
+    <w:lsdException w:name="Medium Grid 2 Accent 3" w:uiPriority="-890636544"/>
+    <w:lsdException w:name="Medium Grid 3 Accent 3" w:uiPriority="-889390631"/>
+    <w:lsdException w:name="Dark List Accent 3" w:uiPriority="318785042"/>
+    <w:lsdException w:name="Colorful Shading Accent 3" w:uiPriority="328336275"/>
+    <w:lsdException w:name="Colorful List Accent 3" w:uiPriority="-1987824012"/>
+    <w:lsdException w:name="Colorful Grid Accent 3" w:uiPriority="-1987808681"/>
+    <w:lsdException w:name="Light Shading Accent 4" w:uiPriority="-862331538"/>
+    <w:lsdException w:name="Light List Accent 4" w:uiPriority="-332419"/>
+    <w:lsdException w:name="Light Grid Accent 4" w:uiPriority="1495684904"/>
+    <w:lsdException w:name="Medium Shading 1 Accent 4" w:uiPriority="1495684953"/>
+    <w:lsdException w:name="Medium Shading 2 Accent 4" w:uiPriority="1720381392"/>
+    <w:lsdException w:name="Medium List 1 Accent 4" w:uiPriority="-1496778307"/>
+    <w:lsdException w:name="Medium List 2 Accent 4" w:uiPriority="302158468"/>
+    <w:lsdException w:name="Medium Grid 1 Accent 4" w:uiPriority="302158469"/>
+    <w:lsdException w:name="Medium Grid 2 Accent 4" w:uiPriority="-890636544"/>
+    <w:lsdException w:name="Medium Grid 3 Accent 4" w:uiPriority="-889390631"/>
+    <w:lsdException w:name="Dark List Accent 4" w:uiPriority="318785042"/>
+    <w:lsdException w:name="Colorful Shading Accent 4" w:uiPriority="328336275"/>
+    <w:lsdException w:name="Colorful List Accent 4" w:uiPriority="-1987824012"/>
+    <w:lsdException w:name="Colorful Grid Accent 4" w:uiPriority="-1987808681"/>
+    <w:lsdException w:name="Light Shading Accent 5" w:uiPriority="-862331538"/>
+    <w:lsdException w:name="Light List Accent 5" w:uiPriority="-332419"/>
+    <w:lsdException w:name="Light Grid Accent 5" w:uiPriority="1495684904"/>
+    <w:lsdException w:name="Medium Shading 1 Accent 5" w:uiPriority="1495684953"/>
+    <w:lsdException w:name="Medium Shading 2 Accent 5" w:uiPriority="1720381392"/>
+    <w:lsdException w:name="Medium List 1 Accent 5" w:uiPriority="-1496778307"/>
+    <w:lsdException w:name="Medium List 2 Accent 5" w:uiPriority="302158468"/>
+    <w:lsdException w:name="Medium Grid 1 Accent 5" w:uiPriority="302158469"/>
+    <w:lsdException w:name="Medium Grid 2 Accent 5" w:uiPriority="-890636544"/>
+    <w:lsdException w:name="Medium Grid 3 Accent 5" w:uiPriority="-889390631"/>
+    <w:lsdException w:name="Dark List Accent 5" w:uiPriority="318785042"/>
+    <w:lsdException w:name="Colorful Shading Accent 5" w:uiPriority="328336275"/>
+    <w:lsdException w:name="Colorful List Accent 5" w:uiPriority="-1987824012"/>
+    <w:lsdException w:name="Colorful Grid Accent 5" w:uiPriority="-1987808681"/>
+    <w:lsdException w:name="Light Shading Accent 6" w:uiPriority="-862331538"/>
+    <w:lsdException w:name="Light List Accent 6" w:uiPriority="-332419"/>
+    <w:lsdException w:name="Light Grid Accent 6" w:uiPriority="1495684904"/>
+    <w:lsdException w:name="Medium Shading 1 Accent 6" w:uiPriority="1495684953"/>
+    <w:lsdException w:name="Medium Shading 2 Accent 6" w:uiPriority="1720381392"/>
+    <w:lsdException w:name="Medium List 1 Accent 6" w:uiPriority="-1496778307"/>
+    <w:lsdException w:name="Medium List 2 Accent 6" w:uiPriority="302158468"/>
+    <w:lsdException w:name="Medium Grid 1 Accent 6" w:uiPriority="302158469"/>
+    <w:lsdException w:name="Medium Grid 2 Accent 6" w:uiPriority="-890636544"/>
+    <w:lsdException w:name="Medium Grid 3 Accent 6" w:uiPriority="-889390631"/>
+    <w:lsdException w:name="Dark List Accent 6" w:uiPriority="318785042"/>
+    <w:lsdException w:name="Colorful Shading Accent 6" w:uiPriority="328336275"/>
+    <w:lsdException w:name="Colorful List Accent 6" w:uiPriority="-1987824012"/>
+    <w:lsdException w:name="Colorful Grid Accent 6" w:uiPriority="-1987808681"/>
+    <w:lsdException w:name="Subtle Emphasis" w:uiPriority="-923047271" w:qFormat="1"/>
+    <w:lsdException w:name="Intense Emphasis" w:uiPriority="1108755237" w:qFormat="1"/>
+    <w:lsdException w:name="Subtle Reference" w:uiPriority="-1789655727" w:qFormat="1"/>
+    <w:lsdException w:name="Intense Reference" w:uiPriority="1481070706" w:qFormat="1"/>
+    <w:lsdException w:name="Book Title" w:uiPriority="141906487" w:qFormat="1"/>
+    <w:lsdException w:name="Bibliography" w:semiHidden="1" w:uiPriority="2025242623" w:unhideWhenUsed="1"/>
+    <w:lsdException w:name="TOC Heading" w:semiHidden="1" w:uiPriority="-2094852797" w:unhideWhenUsed="1" w:qFormat="1"/>
+    <w:lsdException w:name="Plain Table 1" w:uiPriority="-1359370643"/>
+    <w:lsdException w:name="Plain Table 2" w:uiPriority="1112029284"/>
+    <w:lsdException w:name="Plain Table 3" w:uiPriority="1112029285"/>
+    <w:lsdException w:name="Plain Table 4" w:uiPriority="-35160900"/>
+    <w:lsdException w:name="Plain Table 5" w:uiPriority="-35030627"/>
+    <w:lsdException w:name="Grid Table Light" w:uiPriority="-1499751030"/>
+    <w:lsdException w:name="Grid Table 1 Light" w:uiPriority="813004612"/>
+    <w:lsdException w:name="Grid Table 2" w:uiPriority="813920393"/>
+    <w:lsdException w:name="Grid Table 3" w:uiPriority="1989843674"/>
+    <w:lsdException w:name="Grid Table 4" w:uiPriority="1989847257"/>
+    <w:lsdException w:name="Grid Table 5 Dark" w:uiPriority="-2130245882"/>
+    <w:lsdException w:name="Grid Table 6 Colorful" w:uiPriority="1099981959"/>
+    <w:lsdException w:name="Grid Table 7 Colorful" w:uiPriority="395347856"/>
+    <w:lsdException w:name="Grid Table 1 Light Accent 1" w:uiPriority="813004612"/>
+    <w:lsdException w:name="Grid Table 2 Accent 1" w:uiPriority="813920393"/>
+    <w:lsdException w:name="Grid Table 3 Accent 1" w:uiPriority="1989843674"/>
+    <w:lsdException w:name="Grid Table 4 Accent 1" w:uiPriority="1989847257"/>
+    <w:lsdException w:name="Grid Table 5 Dark Accent 1" w:uiPriority="-2130245882"/>
+    <w:lsdException w:name="Grid Table 6 Colorful Accent 1" w:uiPriority="1099981959"/>
+    <w:lsdException w:name="Grid Table 7 Colorful Accent 1" w:uiPriority="395347856"/>
+    <w:lsdException w:name="Grid Table 1 Light Accent 2" w:uiPriority="813004612"/>
+    <w:lsdException w:name="Grid Table 2 Accent 2" w:uiPriority="813920393"/>
+    <w:lsdException w:name="Grid Table 3 Accent 2" w:uiPriority="1989843674"/>
+    <w:lsdException w:name="Grid Table 4 Accent 2" w:uiPriority="1989847257"/>
+    <w:lsdException w:name="Grid Table 5 Dark Accent 2" w:uiPriority="-2130245882"/>
+    <w:lsdException w:name="Grid Table 6 Colorful Accent 2" w:uiPriority="1099981959"/>
+    <w:lsdException w:name="Grid Table 7 Colorful Accent 2" w:uiPriority="395347856"/>
+    <w:lsdException w:name="Grid Table 1 Light Accent 3" w:uiPriority="813004612"/>
+    <w:lsdException w:name="Grid Table 2 Accent 3" w:uiPriority="813920393"/>
+    <w:lsdException w:name="Grid Table 3 Accent 3" w:uiPriority="1989843674"/>
+    <w:lsdException w:name="Grid Table 4 Accent 3" w:uiPriority="1989847257"/>
+    <w:lsdException w:name="Grid Table 5 Dark Accent 3" w:uiPriority="-2130245882"/>
+    <w:lsdException w:name="Grid Table 6 Colorful Accent 3" w:uiPriority="1099981959"/>
+    <w:lsdException w:name="Grid Table 7 Colorful Accent 3" w:uiPriority="395347856"/>
+    <w:lsdException w:name="Grid Table 1 Light Accent 4" w:uiPriority="813004612"/>
+    <w:lsdException w:name="Grid Table 2 Accent 4" w:uiPriority="813920393"/>
+    <w:lsdException w:name="Grid Table 3 Accent 4" w:uiPriority="1989843674"/>
+    <w:lsdException w:name="Grid Table 4 Accent 4" w:uiPriority="1989847257"/>
+    <w:lsdException w:name="Grid Table 5 Dark Accent 4" w:uiPriority="-2130245882"/>
+    <w:lsdException w:name="Grid Table 6 Colorful Accent 4" w:uiPriority="1099981959"/>
+    <w:lsdException w:name="Grid Table 7 Colorful Accent 4" w:uiPriority="395347856"/>
+    <w:lsdException w:name="Grid Table 1 Light Accent 5" w:uiPriority="813004612"/>
+    <w:lsdException w:name="Grid Table 2 Accent 5" w:uiPriority="813920393"/>
+    <w:lsdException w:name="Grid Table 3 Accent 5" w:uiPriority="1989843674"/>
+    <w:lsdException w:name="Grid Table 4 Accent 5" w:uiPriority="1989847257"/>
+    <w:lsdException w:name="Grid Table 5 Dark Accent 5" w:uiPriority="-2130245882"/>
+    <w:lsdException w:name="Grid Table 6 Colorful Accent 5" w:uiPriority="1099981959"/>
+    <w:lsdException w:name="Grid Table 7 Colorful Accent 5" w:uiPriority="395347856"/>
+    <w:lsdException w:name="Grid Table 1 Light Accent 6" w:uiPriority="813004612"/>
+    <w:lsdException w:name="Grid Table 2 Accent 6" w:uiPriority="813920393"/>
+    <w:lsdException w:name="Grid Table 3 Accent 6" w:uiPriority="1989843674"/>
+    <w:lsdException w:name="Grid Table 4 Accent 6" w:uiPriority="1989847257"/>
+    <w:lsdException w:name="Grid Table 5 Dark Accent 6" w:uiPriority="-2130245882"/>
+    <w:lsdException w:name="Grid Table 6 Colorful Accent 6" w:uiPriority="1099981959"/>
+    <w:lsdException w:name="Grid Table 7 Colorful Accent 6" w:uiPriority="395347856"/>
+    <w:lsdException w:name="List Table 1 Light" w:uiPriority="813004612"/>
+    <w:lsdException w:name="List Table 2" w:uiPriority="813920393"/>
+    <w:lsdException w:name="List Table 3" w:uiPriority="1989843674"/>
+    <w:lsdException w:name="List Table 4" w:uiPriority="1989847257"/>
+    <w:lsdException w:name="List Table 5 Dark" w:uiPriority="-2130245882"/>
+    <w:lsdException w:name="List Table 6 Colorful" w:uiPriority="1099981959"/>
+    <w:lsdException w:name="List Table 7 Colorful" w:uiPriority="395347856"/>
+    <w:lsdException w:name="List Table 1 Light Accent 1" w:uiPriority="813004612"/>
+    <w:lsdException w:name="List Table 2 Accent 1" w:uiPriority="813920393"/>
+    <w:lsdException w:name="List Table 3 Accent 1" w:uiPriority="1989843674"/>
+    <w:lsdException w:name="List Table 4 Accent 1" w:uiPriority="1989847257"/>
+    <w:lsdException w:name="List Table 5 Dark Accent 1" w:uiPriority="-2130245882"/>
+    <w:lsdException w:name="List Table 6 Colorful Accent 1" w:uiPriority="1099981959"/>
+    <w:lsdException w:name="List Table 7 Colorful Accent 1" w:uiPriority="395347856"/>
+    <w:lsdException w:name="List Table 1 Light Accent 2" w:uiPriority="813004612"/>
+    <w:lsdException w:name="List Table 2 Accent 2" w:uiPriority="813920393"/>
+    <w:lsdException w:name="List Table 3 Accent 2" w:uiPriority="1989843674"/>
+    <w:lsdException w:name="List Table 4 Accent 2" w:uiPriority="1989847257"/>
+    <w:lsdException w:name="List Table 5 Dark Accent 2" w:uiPriority="-2130245882"/>
+    <w:lsdException w:name="List Table 6 Colorful Accent 2" w:uiPriority="1099981959"/>
+    <w:lsdException w:name="List Table 7 Colorful Accent 2" w:uiPriority="395347856"/>
+    <w:lsdException w:name="List Table 1 Light Accent 3" w:uiPriority="813004612"/>
+    <w:lsdException w:name="List Table 2 Accent 3" w:uiPriority="813920393"/>
+    <w:lsdException w:name="List Table 3 Accent 3" w:uiPriority="1989843674"/>
+    <w:lsdException w:name="List Table 4 Accent 3" w:uiPriority="1989847257"/>
+    <w:lsdException w:name="List Table 5 Dark Accent 3" w:uiPriority="-2130245882"/>
+    <w:lsdException w:name="List Table 6 Colorful Accent 3" w:uiPriority="1099981959"/>
+    <w:lsdException w:name="List Table 7 Colorful Accent 3" w:uiPriority="395347856"/>
+    <w:lsdException w:name="List Table 1 Light Accent 4" w:uiPriority="813004612"/>
+    <w:lsdException w:name="List Table 2 Accent 4" w:uiPriority="813920393"/>
+    <w:lsdException w:name="List Table 3 Accent 4" w:uiPriority="1989843674"/>
+    <w:lsdException w:name="List Table 4 Accent 4" w:uiPriority="1989847257"/>
+    <w:lsdException w:name="List Table 5 Dark Accent 4" w:uiPriority="-2130245882"/>
+    <w:lsdException w:name="List Table 6 Colorful Accent 4" w:uiPriority="1099981959"/>
+    <w:lsdException w:name="List Table 7 Colorful Accent 4" w:uiPriority="395347856"/>
+    <w:lsdException w:name="List Table 1 Light Accent 5" w:uiPriority="813004612"/>
+    <w:lsdException w:name="List Table 2 Accent 5" w:uiPriority="813920393"/>
+    <w:lsdException w:name="List Table 3 Accent 5" w:uiPriority="1989843674"/>
+    <w:lsdException w:name="List Table 4 Accent 5" w:uiPriority="1989847257"/>
+    <w:lsdException w:name="List Table 5 Dark Accent 5" w:uiPriority="-2130245882"/>
+    <w:lsdException w:name="List Table 6 Colorful Accent 5" w:uiPriority="1099981959"/>
+    <w:lsdException w:name="List Table 7 Colorful Accent 5" w:uiPriority="395347856"/>
+    <w:lsdException w:name="List Table 1 Light Accent 6" w:uiPriority="813004612"/>
+    <w:lsdException w:name="List Table 2 Accent 6" w:uiPriority="813920393"/>
+    <w:lsdException w:name="List Table 3 Accent 6" w:uiPriority="1989843674"/>
+    <w:lsdException w:name="List Table 4 Accent 6" w:uiPriority="1989847257"/>
+    <w:lsdException w:name="List Table 5 Dark Accent 6" w:uiPriority="-2130245882"/>
+    <w:lsdException w:name="List Table 6 Colorful Accent 6" w:uiPriority="1099981959"/>
+    <w:lsdException w:name="List Table 7 Colorful Accent 6" w:uiPriority="395347856"/>
   </w:latentStyles>
   <w:style w:type="paragraph" w:default="1" w:styleId="a2">
     <w:name w:val="Normal"/>

</xml_diff>